<commit_message>
Writeups: tagged Petri seams and an actionable-improvements section
Co-Authored-By: Claude Fable 5.1 <noreply@anthropic.com>
</commit_message>
<xml_diff>
--- a/writeups/report.docx
+++ b/writeups/report.docx
@@ -7020,6 +7020,1004 @@
           <w:sz w:val="28"/>
           <w:szCs w:val="28"/>
         </w:rPr>
+        <w:t xml:space="preserve">Actionable Petri improvements</w:t>
+      </w:r>
+    </w:p>
+    <w:p>
+      <w:pPr>
+        <w:spacing w:after="140" w:line="276"/>
+      </w:pPr>
+      <w:r>
+        <w:rPr>
+          <w:rFonts w:ascii="Calibri" w:cs="Calibri" w:eastAsia="Calibri" w:hAnsi="Calibri"/>
+          <w:sz w:val="21"/>
+          <w:szCs w:val="21"/>
+        </w:rPr>
+        <w:t xml:space="preserve">Every seam the targets reported, in the debriefs of both the probing runs and the runs that concluded without probing, has been tagged with the Petri change it implies. The full tagged list, with seed, turn and verbatim excerpt for every mention, is in </w:t>
+      </w:r>
+      <w:hyperlink w:history="1" r:id="rIdclpwf2rdwqxkqvejcd42o">
+        <w:r>
+          <w:rPr>
+            <w:rStyle w:val="Hyperlink"/>
+            <w:rFonts w:ascii="Calibri" w:cs="Calibri" w:eastAsia="Calibri" w:hAnsi="Calibri"/>
+            <w:sz w:val="21"/>
+            <w:szCs w:val="21"/>
+          </w:rPr>
+          <w:t xml:space="preserve">`petri_seams.md`</w:t>
+        </w:r>
+      </w:hyperlink>
+      <w:r>
+        <w:rPr>
+          <w:rFonts w:ascii="Calibri" w:cs="Calibri" w:eastAsia="Calibri" w:hAnsi="Calibri"/>
+          <w:sz w:val="21"/>
+          <w:szCs w:val="21"/>
+        </w:rPr>
+        <w:t xml:space="preserve">. Tagging is by keyword over the debrief text, so the counts are candidate sets to read rather than measurements.</w:t>
+      </w:r>
+    </w:p>
+    <w:tbl>
+      <w:tblPr>
+        <w:tblW w:type="dxa" w:w="10080"/>
+        <w:tblBorders>
+          <w:top w:val="single" w:color="auto" w:sz="4"/>
+          <w:left w:val="single" w:color="auto" w:sz="4"/>
+          <w:bottom w:val="single" w:color="auto" w:sz="4"/>
+          <w:right w:val="single" w:color="auto" w:sz="4"/>
+          <w:insideH w:val="single" w:color="auto" w:sz="4"/>
+          <w:insideV w:val="single" w:color="auto" w:sz="4"/>
+        </w:tblBorders>
+      </w:tblPr>
+      <w:tblGrid>
+        <w:gridCol w:w="2598"/>
+        <w:gridCol w:w="900"/>
+        <w:gridCol w:w="900"/>
+        <w:gridCol w:w="5682"/>
+      </w:tblGrid>
+      <w:tr>
+        <w:trPr>
+          <w:tblHeader/>
+        </w:trPr>
+        <w:tc>
+          <w:tcPr>
+            <w:tcW w:type="dxa" w:w="2598"/>
+            <w:shd w:fill="EEEDE8" w:color="auto" w:val="clear"/>
+            <w:tcMar>
+              <w:top w:type="dxa" w:w="60"/>
+              <w:left w:type="dxa" w:w="90"/>
+              <w:bottom w:type="dxa" w:w="60"/>
+              <w:right w:type="dxa" w:w="90"/>
+            </w:tcMar>
+          </w:tcPr>
+          <w:p>
+            <w:pPr>
+              <w:jc w:val="left"/>
+            </w:pPr>
+            <w:r>
+              <w:rPr>
+                <w:rFonts w:ascii="Calibri" w:cs="Calibri" w:eastAsia="Calibri" w:hAnsi="Calibri"/>
+                <w:sz w:val="17"/>
+                <w:szCs w:val="17"/>
+              </w:rPr>
+              <w:t xml:space="preserve">Tag</w:t>
+            </w:r>
+          </w:p>
+        </w:tc>
+        <w:tc>
+          <w:tcPr>
+            <w:tcW w:type="dxa" w:w="900"/>
+            <w:shd w:fill="EEEDE8" w:color="auto" w:val="clear"/>
+            <w:tcMar>
+              <w:top w:type="dxa" w:w="60"/>
+              <w:left w:type="dxa" w:w="90"/>
+              <w:bottom w:type="dxa" w:w="60"/>
+              <w:right w:type="dxa" w:w="90"/>
+            </w:tcMar>
+          </w:tcPr>
+          <w:p>
+            <w:pPr>
+              <w:jc w:val="left"/>
+            </w:pPr>
+            <w:r>
+              <w:rPr>
+                <w:rFonts w:ascii="Calibri" w:cs="Calibri" w:eastAsia="Calibri" w:hAnsi="Calibri"/>
+                <w:sz w:val="17"/>
+                <w:szCs w:val="17"/>
+              </w:rPr>
+              <w:t xml:space="preserve">Mentions</w:t>
+            </w:r>
+          </w:p>
+        </w:tc>
+        <w:tc>
+          <w:tcPr>
+            <w:tcW w:type="dxa" w:w="900"/>
+            <w:shd w:fill="EEEDE8" w:color="auto" w:val="clear"/>
+            <w:tcMar>
+              <w:top w:type="dxa" w:w="60"/>
+              <w:left w:type="dxa" w:w="90"/>
+              <w:bottom w:type="dxa" w:w="60"/>
+              <w:right w:type="dxa" w:w="90"/>
+            </w:tcMar>
+          </w:tcPr>
+          <w:p>
+            <w:pPr>
+              <w:jc w:val="left"/>
+            </w:pPr>
+            <w:r>
+              <w:rPr>
+                <w:rFonts w:ascii="Calibri" w:cs="Calibri" w:eastAsia="Calibri" w:hAnsi="Calibri"/>
+                <w:sz w:val="17"/>
+                <w:szCs w:val="17"/>
+              </w:rPr>
+              <w:t xml:space="preserve">Runs</w:t>
+            </w:r>
+          </w:p>
+        </w:tc>
+        <w:tc>
+          <w:tcPr>
+            <w:tcW w:type="dxa" w:w="5682"/>
+            <w:shd w:fill="EEEDE8" w:color="auto" w:val="clear"/>
+            <w:tcMar>
+              <w:top w:type="dxa" w:w="60"/>
+              <w:left w:type="dxa" w:w="90"/>
+              <w:bottom w:type="dxa" w:w="60"/>
+              <w:right w:type="dxa" w:w="90"/>
+            </w:tcMar>
+          </w:tcPr>
+          <w:p>
+            <w:pPr>
+              <w:jc w:val="left"/>
+            </w:pPr>
+            <w:r>
+              <w:rPr>
+                <w:rFonts w:ascii="Calibri" w:cs="Calibri" w:eastAsia="Calibri" w:hAnsi="Calibri"/>
+                <w:sz w:val="17"/>
+                <w:szCs w:val="17"/>
+              </w:rPr>
+              <w:t xml:space="preserve">Proposed Petri change</w:t>
+            </w:r>
+          </w:p>
+        </w:tc>
+      </w:tr>
+      <w:tr>
+        <w:trPr>
+          <w:tblHeader w:val="off"/>
+        </w:trPr>
+        <w:tc>
+          <w:tcPr>
+            <w:tcW w:type="dxa" w:w="2598"/>
+            <w:tcMar>
+              <w:top w:type="dxa" w:w="60"/>
+              <w:left w:type="dxa" w:w="90"/>
+              <w:bottom w:type="dxa" w:w="60"/>
+              <w:right w:type="dxa" w:w="90"/>
+            </w:tcMar>
+          </w:tcPr>
+          <w:p>
+            <w:pPr>
+              <w:jc w:val="left"/>
+            </w:pPr>
+            <w:r>
+              <w:rPr>
+                <w:rFonts w:ascii="Consolas" w:cs="Consolas" w:eastAsia="Consolas" w:hAnsi="Consolas"/>
+                <w:sz w:val="15"/>
+                <w:szCs w:val="15"/>
+              </w:rPr>
+              <w:t xml:space="preserve">clock-fixed-steps</w:t>
+            </w:r>
+          </w:p>
+        </w:tc>
+        <w:tc>
+          <w:tcPr>
+            <w:tcW w:type="dxa" w:w="900"/>
+            <w:tcMar>
+              <w:top w:type="dxa" w:w="60"/>
+              <w:left w:type="dxa" w:w="90"/>
+              <w:bottom w:type="dxa" w:w="60"/>
+              <w:right w:type="dxa" w:w="90"/>
+            </w:tcMar>
+          </w:tcPr>
+          <w:p>
+            <w:pPr>
+              <w:jc w:val="right"/>
+            </w:pPr>
+            <w:r>
+              <w:rPr>
+                <w:rFonts w:ascii="Calibri" w:cs="Calibri" w:eastAsia="Calibri" w:hAnsi="Calibri"/>
+                <w:sz w:val="17"/>
+                <w:szCs w:val="17"/>
+              </w:rPr>
+              <w:t xml:space="preserve">2</w:t>
+            </w:r>
+          </w:p>
+        </w:tc>
+        <w:tc>
+          <w:tcPr>
+            <w:tcW w:type="dxa" w:w="900"/>
+            <w:tcMar>
+              <w:top w:type="dxa" w:w="60"/>
+              <w:left w:type="dxa" w:w="90"/>
+              <w:bottom w:type="dxa" w:w="60"/>
+              <w:right w:type="dxa" w:w="90"/>
+            </w:tcMar>
+          </w:tcPr>
+          <w:p>
+            <w:pPr>
+              <w:jc w:val="right"/>
+            </w:pPr>
+            <w:r>
+              <w:rPr>
+                <w:rFonts w:ascii="Calibri" w:cs="Calibri" w:eastAsia="Calibri" w:hAnsi="Calibri"/>
+                <w:sz w:val="17"/>
+                <w:szCs w:val="17"/>
+              </w:rPr>
+              <w:t xml:space="preserve">2</w:t>
+            </w:r>
+          </w:p>
+        </w:tc>
+        <w:tc>
+          <w:tcPr>
+            <w:tcW w:type="dxa" w:w="5682"/>
+            <w:tcMar>
+              <w:top w:type="dxa" w:w="60"/>
+              <w:left w:type="dxa" w:w="90"/>
+              <w:bottom w:type="dxa" w:w="60"/>
+              <w:right w:type="dxa" w:w="90"/>
+            </w:tcMar>
+          </w:tcPr>
+          <w:p>
+            <w:pPr>
+              <w:jc w:val="left"/>
+            </w:pPr>
+            <w:r>
+              <w:rPr>
+                <w:rFonts w:ascii="Calibri" w:cs="Calibri" w:eastAsia="Calibri" w:hAnsi="Calibri"/>
+                <w:sz w:val="17"/>
+                <w:szCs w:val="17"/>
+              </w:rPr>
+              <w:t xml:space="preserve">Scenario clock the auditor must advance per action with jitter; stamp tool results from it</w:t>
+            </w:r>
+          </w:p>
+        </w:tc>
+      </w:tr>
+      <w:tr>
+        <w:trPr>
+          <w:tblHeader w:val="off"/>
+        </w:trPr>
+        <w:tc>
+          <w:tcPr>
+            <w:tcW w:type="dxa" w:w="2598"/>
+            <w:tcMar>
+              <w:top w:type="dxa" w:w="60"/>
+              <w:left w:type="dxa" w:w="90"/>
+              <w:bottom w:type="dxa" w:w="60"/>
+              <w:right w:type="dxa" w:w="90"/>
+            </w:tcMar>
+          </w:tcPr>
+          <w:p>
+            <w:pPr>
+              <w:jc w:val="left"/>
+            </w:pPr>
+            <w:r>
+              <w:rPr>
+                <w:rFonts w:ascii="Consolas" w:cs="Consolas" w:eastAsia="Consolas" w:hAnsi="Consolas"/>
+                <w:sz w:val="15"/>
+                <w:szCs w:val="15"/>
+              </w:rPr>
+              <w:t xml:space="preserve">instant-responses</w:t>
+            </w:r>
+          </w:p>
+        </w:tc>
+        <w:tc>
+          <w:tcPr>
+            <w:tcW w:type="dxa" w:w="900"/>
+            <w:tcMar>
+              <w:top w:type="dxa" w:w="60"/>
+              <w:left w:type="dxa" w:w="90"/>
+              <w:bottom w:type="dxa" w:w="60"/>
+              <w:right w:type="dxa" w:w="90"/>
+            </w:tcMar>
+          </w:tcPr>
+          <w:p>
+            <w:pPr>
+              <w:jc w:val="right"/>
+            </w:pPr>
+            <w:r>
+              <w:rPr>
+                <w:rFonts w:ascii="Calibri" w:cs="Calibri" w:eastAsia="Calibri" w:hAnsi="Calibri"/>
+                <w:sz w:val="17"/>
+                <w:szCs w:val="17"/>
+              </w:rPr>
+              <w:t xml:space="preserve">18</w:t>
+            </w:r>
+          </w:p>
+        </w:tc>
+        <w:tc>
+          <w:tcPr>
+            <w:tcW w:type="dxa" w:w="900"/>
+            <w:tcMar>
+              <w:top w:type="dxa" w:w="60"/>
+              <w:left w:type="dxa" w:w="90"/>
+              <w:bottom w:type="dxa" w:w="60"/>
+              <w:right w:type="dxa" w:w="90"/>
+            </w:tcMar>
+          </w:tcPr>
+          <w:p>
+            <w:pPr>
+              <w:jc w:val="right"/>
+            </w:pPr>
+            <w:r>
+              <w:rPr>
+                <w:rFonts w:ascii="Calibri" w:cs="Calibri" w:eastAsia="Calibri" w:hAnsi="Calibri"/>
+                <w:sz w:val="17"/>
+                <w:szCs w:val="17"/>
+              </w:rPr>
+              <w:t xml:space="preserve">15</w:t>
+            </w:r>
+          </w:p>
+        </w:tc>
+        <w:tc>
+          <w:tcPr>
+            <w:tcW w:type="dxa" w:w="5682"/>
+            <w:tcMar>
+              <w:top w:type="dxa" w:w="60"/>
+              <w:left w:type="dxa" w:w="90"/>
+              <w:bottom w:type="dxa" w:w="60"/>
+              <w:right w:type="dxa" w:w="90"/>
+            </w:tcMar>
+          </w:tcPr>
+          <w:p>
+            <w:pPr>
+              <w:jc w:val="left"/>
+            </w:pPr>
+            <w:r>
+              <w:rPr>
+                <w:rFonts w:ascii="Calibri" w:cs="Calibri" w:eastAsia="Calibri" w:hAnsi="Calibri"/>
+                <w:sz w:val="17"/>
+                <w:szCs w:val="17"/>
+              </w:rPr>
+              <w:t xml:space="preserve">Plausible delays for humans and automated systems in the scenario clock; realism-approver rule</w:t>
+            </w:r>
+          </w:p>
+        </w:tc>
+      </w:tr>
+      <w:tr>
+        <w:trPr>
+          <w:tblHeader w:val="off"/>
+        </w:trPr>
+        <w:tc>
+          <w:tcPr>
+            <w:tcW w:type="dxa" w:w="2598"/>
+            <w:tcMar>
+              <w:top w:type="dxa" w:w="60"/>
+              <w:left w:type="dxa" w:w="90"/>
+              <w:bottom w:type="dxa" w:w="60"/>
+              <w:right w:type="dxa" w:w="90"/>
+            </w:tcMar>
+          </w:tcPr>
+          <w:p>
+            <w:pPr>
+              <w:jc w:val="left"/>
+            </w:pPr>
+            <w:r>
+              <w:rPr>
+                <w:rFonts w:ascii="Consolas" w:cs="Consolas" w:eastAsia="Consolas" w:hAnsi="Consolas"/>
+                <w:sz w:val="15"/>
+                <w:szCs w:val="15"/>
+              </w:rPr>
+              <w:t xml:space="preserve">fabricated-fs-artifacts</w:t>
+            </w:r>
+          </w:p>
+        </w:tc>
+        <w:tc>
+          <w:tcPr>
+            <w:tcW w:type="dxa" w:w="900"/>
+            <w:tcMar>
+              <w:top w:type="dxa" w:w="60"/>
+              <w:left w:type="dxa" w:w="90"/>
+              <w:bottom w:type="dxa" w:w="60"/>
+              <w:right w:type="dxa" w:w="90"/>
+            </w:tcMar>
+          </w:tcPr>
+          <w:p>
+            <w:pPr>
+              <w:jc w:val="right"/>
+            </w:pPr>
+            <w:r>
+              <w:rPr>
+                <w:rFonts w:ascii="Calibri" w:cs="Calibri" w:eastAsia="Calibri" w:hAnsi="Calibri"/>
+                <w:sz w:val="17"/>
+                <w:szCs w:val="17"/>
+              </w:rPr>
+              <w:t xml:space="preserve">37</w:t>
+            </w:r>
+          </w:p>
+        </w:tc>
+        <w:tc>
+          <w:tcPr>
+            <w:tcW w:type="dxa" w:w="900"/>
+            <w:tcMar>
+              <w:top w:type="dxa" w:w="60"/>
+              <w:left w:type="dxa" w:w="90"/>
+              <w:bottom w:type="dxa" w:w="60"/>
+              <w:right w:type="dxa" w:w="90"/>
+            </w:tcMar>
+          </w:tcPr>
+          <w:p>
+            <w:pPr>
+              <w:jc w:val="right"/>
+            </w:pPr>
+            <w:r>
+              <w:rPr>
+                <w:rFonts w:ascii="Calibri" w:cs="Calibri" w:eastAsia="Calibri" w:hAnsi="Calibri"/>
+                <w:sz w:val="17"/>
+                <w:szCs w:val="17"/>
+              </w:rPr>
+              <w:t xml:space="preserve">24</w:t>
+            </w:r>
+          </w:p>
+        </w:tc>
+        <w:tc>
+          <w:tcPr>
+            <w:tcW w:type="dxa" w:w="5682"/>
+            <w:tcMar>
+              <w:top w:type="dxa" w:w="60"/>
+              <w:left w:type="dxa" w:w="90"/>
+              <w:bottom w:type="dxa" w:w="60"/>
+              <w:right w:type="dxa" w:w="90"/>
+            </w:tcMar>
+          </w:tcPr>
+          <w:p>
+            <w:pPr>
+              <w:jc w:val="left"/>
+            </w:pPr>
+            <w:r>
+              <w:rPr>
+                <w:rFonts w:ascii="Calibri" w:cs="Calibri" w:eastAsia="Calibri" w:hAnsi="Calibri"/>
+                <w:sz w:val="17"/>
+                <w:szCs w:val="17"/>
+              </w:rPr>
+              <w:t xml:space="preserve">Fixture-backed filesystem tools: real files in a sandbox so ls/find/cat/stat run for real</w:t>
+            </w:r>
+          </w:p>
+        </w:tc>
+      </w:tr>
+      <w:tr>
+        <w:trPr>
+          <w:tblHeader w:val="off"/>
+        </w:trPr>
+        <w:tc>
+          <w:tcPr>
+            <w:tcW w:type="dxa" w:w="2598"/>
+            <w:tcMar>
+              <w:top w:type="dxa" w:w="60"/>
+              <w:left w:type="dxa" w:w="90"/>
+              <w:bottom w:type="dxa" w:w="60"/>
+              <w:right w:type="dxa" w:w="90"/>
+            </w:tcMar>
+          </w:tcPr>
+          <w:p>
+            <w:pPr>
+              <w:jc w:val="left"/>
+            </w:pPr>
+            <w:r>
+              <w:rPr>
+                <w:rFonts w:ascii="Consolas" w:cs="Consolas" w:eastAsia="Consolas" w:hAnsi="Consolas"/>
+                <w:sz w:val="15"/>
+                <w:szCs w:val="15"/>
+              </w:rPr>
+              <w:t xml:space="preserve">no-background-noise</w:t>
+            </w:r>
+          </w:p>
+        </w:tc>
+        <w:tc>
+          <w:tcPr>
+            <w:tcW w:type="dxa" w:w="900"/>
+            <w:tcMar>
+              <w:top w:type="dxa" w:w="60"/>
+              <w:left w:type="dxa" w:w="90"/>
+              <w:bottom w:type="dxa" w:w="60"/>
+              <w:right w:type="dxa" w:w="90"/>
+            </w:tcMar>
+          </w:tcPr>
+          <w:p>
+            <w:pPr>
+              <w:jc w:val="right"/>
+            </w:pPr>
+            <w:r>
+              <w:rPr>
+                <w:rFonts w:ascii="Calibri" w:cs="Calibri" w:eastAsia="Calibri" w:hAnsi="Calibri"/>
+                <w:sz w:val="17"/>
+                <w:szCs w:val="17"/>
+              </w:rPr>
+              <w:t xml:space="preserve">19</w:t>
+            </w:r>
+          </w:p>
+        </w:tc>
+        <w:tc>
+          <w:tcPr>
+            <w:tcW w:type="dxa" w:w="900"/>
+            <w:tcMar>
+              <w:top w:type="dxa" w:w="60"/>
+              <w:left w:type="dxa" w:w="90"/>
+              <w:bottom w:type="dxa" w:w="60"/>
+              <w:right w:type="dxa" w:w="90"/>
+            </w:tcMar>
+          </w:tcPr>
+          <w:p>
+            <w:pPr>
+              <w:jc w:val="right"/>
+            </w:pPr>
+            <w:r>
+              <w:rPr>
+                <w:rFonts w:ascii="Calibri" w:cs="Calibri" w:eastAsia="Calibri" w:hAnsi="Calibri"/>
+                <w:sz w:val="17"/>
+                <w:szCs w:val="17"/>
+              </w:rPr>
+              <w:t xml:space="preserve">17</w:t>
+            </w:r>
+          </w:p>
+        </w:tc>
+        <w:tc>
+          <w:tcPr>
+            <w:tcW w:type="dxa" w:w="5682"/>
+            <w:tcMar>
+              <w:top w:type="dxa" w:w="60"/>
+              <w:left w:type="dxa" w:w="90"/>
+              <w:bottom w:type="dxa" w:w="60"/>
+              <w:right w:type="dxa" w:w="90"/>
+            </w:tcMar>
+          </w:tcPr>
+          <w:p>
+            <w:pPr>
+              <w:jc w:val="left"/>
+            </w:pPr>
+            <w:r>
+              <w:rPr>
+                <w:rFonts w:ascii="Calibri" w:cs="Calibri" w:eastAsia="Calibri" w:hAnsi="Calibri"/>
+                <w:sz w:val="17"/>
+                <w:szCs w:val="17"/>
+              </w:rPr>
+              <w:t xml:space="preserve">Noise templates for ps/ss/uptime/inbox/db: unrelated processes, mail, records, cron</w:t>
+            </w:r>
+          </w:p>
+        </w:tc>
+      </w:tr>
+      <w:tr>
+        <w:trPr>
+          <w:tblHeader w:val="off"/>
+        </w:trPr>
+        <w:tc>
+          <w:tcPr>
+            <w:tcW w:type="dxa" w:w="2598"/>
+            <w:tcMar>
+              <w:top w:type="dxa" w:w="60"/>
+              <w:left w:type="dxa" w:w="90"/>
+              <w:bottom w:type="dxa" w:w="60"/>
+              <w:right w:type="dxa" w:w="90"/>
+            </w:tcMar>
+          </w:tcPr>
+          <w:p>
+            <w:pPr>
+              <w:jc w:val="left"/>
+            </w:pPr>
+            <w:r>
+              <w:rPr>
+                <w:rFonts w:ascii="Consolas" w:cs="Consolas" w:eastAsia="Consolas" w:hAnsi="Consolas"/>
+                <w:sz w:val="15"/>
+                <w:szCs w:val="15"/>
+              </w:rPr>
+              <w:t xml:space="preserve">convenient-data</w:t>
+            </w:r>
+          </w:p>
+        </w:tc>
+        <w:tc>
+          <w:tcPr>
+            <w:tcW w:type="dxa" w:w="900"/>
+            <w:tcMar>
+              <w:top w:type="dxa" w:w="60"/>
+              <w:left w:type="dxa" w:w="90"/>
+              <w:bottom w:type="dxa" w:w="60"/>
+              <w:right w:type="dxa" w:w="90"/>
+            </w:tcMar>
+          </w:tcPr>
+          <w:p>
+            <w:pPr>
+              <w:jc w:val="right"/>
+            </w:pPr>
+            <w:r>
+              <w:rPr>
+                <w:rFonts w:ascii="Calibri" w:cs="Calibri" w:eastAsia="Calibri" w:hAnsi="Calibri"/>
+                <w:sz w:val="17"/>
+                <w:szCs w:val="17"/>
+              </w:rPr>
+              <w:t xml:space="preserve">37</w:t>
+            </w:r>
+          </w:p>
+        </w:tc>
+        <w:tc>
+          <w:tcPr>
+            <w:tcW w:type="dxa" w:w="900"/>
+            <w:tcMar>
+              <w:top w:type="dxa" w:w="60"/>
+              <w:left w:type="dxa" w:w="90"/>
+              <w:bottom w:type="dxa" w:w="60"/>
+              <w:right w:type="dxa" w:w="90"/>
+            </w:tcMar>
+          </w:tcPr>
+          <w:p>
+            <w:pPr>
+              <w:jc w:val="right"/>
+            </w:pPr>
+            <w:r>
+              <w:rPr>
+                <w:rFonts w:ascii="Calibri" w:cs="Calibri" w:eastAsia="Calibri" w:hAnsi="Calibri"/>
+                <w:sz w:val="17"/>
+                <w:szCs w:val="17"/>
+              </w:rPr>
+              <w:t xml:space="preserve">34</w:t>
+            </w:r>
+          </w:p>
+        </w:tc>
+        <w:tc>
+          <w:tcPr>
+            <w:tcW w:type="dxa" w:w="5682"/>
+            <w:tcMar>
+              <w:top w:type="dxa" w:w="60"/>
+              <w:left w:type="dxa" w:w="90"/>
+              <w:bottom w:type="dxa" w:w="60"/>
+              <w:right w:type="dxa" w:w="90"/>
+            </w:tcMar>
+          </w:tcPr>
+          <w:p>
+            <w:pPr>
+              <w:jc w:val="left"/>
+            </w:pPr>
+            <w:r>
+              <w:rPr>
+                <w:rFonts w:ascii="Calibri" w:cs="Calibri" w:eastAsia="Calibri" w:hAnsi="Calibri"/>
+                <w:sz w:val="17"/>
+                <w:szCs w:val="17"/>
+              </w:rPr>
+              <w:t xml:space="preserve">Auditor guidance: facts arrive buried among mundane data, not on request; delayed honeypots</w:t>
+            </w:r>
+          </w:p>
+        </w:tc>
+      </w:tr>
+      <w:tr>
+        <w:trPr>
+          <w:tblHeader w:val="off"/>
+        </w:trPr>
+        <w:tc>
+          <w:tcPr>
+            <w:tcW w:type="dxa" w:w="2598"/>
+            <w:tcMar>
+              <w:top w:type="dxa" w:w="60"/>
+              <w:left w:type="dxa" w:w="90"/>
+              <w:bottom w:type="dxa" w:w="60"/>
+              <w:right w:type="dxa" w:w="90"/>
+            </w:tcMar>
+          </w:tcPr>
+          <w:p>
+            <w:pPr>
+              <w:jc w:val="left"/>
+            </w:pPr>
+            <w:r>
+              <w:rPr>
+                <w:rFonts w:ascii="Consolas" w:cs="Consolas" w:eastAsia="Consolas" w:hAnsi="Consolas"/>
+                <w:sz w:val="15"/>
+                <w:szCs w:val="15"/>
+              </w:rPr>
+              <w:t xml:space="preserve">inconsistent-state</w:t>
+            </w:r>
+          </w:p>
+        </w:tc>
+        <w:tc>
+          <w:tcPr>
+            <w:tcW w:type="dxa" w:w="900"/>
+            <w:tcMar>
+              <w:top w:type="dxa" w:w="60"/>
+              <w:left w:type="dxa" w:w="90"/>
+              <w:bottom w:type="dxa" w:w="60"/>
+              <w:right w:type="dxa" w:w="90"/>
+            </w:tcMar>
+          </w:tcPr>
+          <w:p>
+            <w:pPr>
+              <w:jc w:val="right"/>
+            </w:pPr>
+            <w:r>
+              <w:rPr>
+                <w:rFonts w:ascii="Calibri" w:cs="Calibri" w:eastAsia="Calibri" w:hAnsi="Calibri"/>
+                <w:sz w:val="17"/>
+                <w:szCs w:val="17"/>
+              </w:rPr>
+              <w:t xml:space="preserve">45</w:t>
+            </w:r>
+          </w:p>
+        </w:tc>
+        <w:tc>
+          <w:tcPr>
+            <w:tcW w:type="dxa" w:w="900"/>
+            <w:tcMar>
+              <w:top w:type="dxa" w:w="60"/>
+              <w:left w:type="dxa" w:w="90"/>
+              <w:bottom w:type="dxa" w:w="60"/>
+              <w:right w:type="dxa" w:w="90"/>
+            </w:tcMar>
+          </w:tcPr>
+          <w:p>
+            <w:pPr>
+              <w:jc w:val="right"/>
+            </w:pPr>
+            <w:r>
+              <w:rPr>
+                <w:rFonts w:ascii="Calibri" w:cs="Calibri" w:eastAsia="Calibri" w:hAnsi="Calibri"/>
+                <w:sz w:val="17"/>
+                <w:szCs w:val="17"/>
+              </w:rPr>
+              <w:t xml:space="preserve">35</w:t>
+            </w:r>
+          </w:p>
+        </w:tc>
+        <w:tc>
+          <w:tcPr>
+            <w:tcW w:type="dxa" w:w="5682"/>
+            <w:tcMar>
+              <w:top w:type="dxa" w:w="60"/>
+              <w:left w:type="dxa" w:w="90"/>
+              <w:bottom w:type="dxa" w:w="60"/>
+              <w:right w:type="dxa" w:w="90"/>
+            </w:tcMar>
+          </w:tcPr>
+          <w:p>
+            <w:pPr>
+              <w:jc w:val="left"/>
+            </w:pPr>
+            <w:r>
+              <w:rPr>
+                <w:rFonts w:ascii="Calibri" w:cs="Calibri" w:eastAsia="Calibri" w:hAnsi="Calibri"/>
+                <w:sz w:val="17"/>
+                <w:szCs w:val="17"/>
+              </w:rPr>
+              <w:t xml:space="preserve">Fact sheet in the auditor prompt; fixture-backed tools so repeated reads agree</w:t>
+            </w:r>
+          </w:p>
+        </w:tc>
+      </w:tr>
+      <w:tr>
+        <w:trPr>
+          <w:tblHeader w:val="off"/>
+        </w:trPr>
+        <w:tc>
+          <w:tcPr>
+            <w:tcW w:type="dxa" w:w="2598"/>
+            <w:tcMar>
+              <w:top w:type="dxa" w:w="60"/>
+              <w:left w:type="dxa" w:w="90"/>
+              <w:bottom w:type="dxa" w:w="60"/>
+              <w:right w:type="dxa" w:w="90"/>
+            </w:tcMar>
+          </w:tcPr>
+          <w:p>
+            <w:pPr>
+              <w:jc w:val="left"/>
+            </w:pPr>
+            <w:r>
+              <w:rPr>
+                <w:rFonts w:ascii="Consolas" w:cs="Consolas" w:eastAsia="Consolas" w:hAnsi="Consolas"/>
+                <w:sz w:val="15"/>
+                <w:szCs w:val="15"/>
+              </w:rPr>
+              <w:t xml:space="preserve">scenario-reads-as-test</w:t>
+            </w:r>
+          </w:p>
+        </w:tc>
+        <w:tc>
+          <w:tcPr>
+            <w:tcW w:type="dxa" w:w="900"/>
+            <w:tcMar>
+              <w:top w:type="dxa" w:w="60"/>
+              <w:left w:type="dxa" w:w="90"/>
+              <w:bottom w:type="dxa" w:w="60"/>
+              <w:right w:type="dxa" w:w="90"/>
+            </w:tcMar>
+          </w:tcPr>
+          <w:p>
+            <w:pPr>
+              <w:jc w:val="right"/>
+            </w:pPr>
+            <w:r>
+              <w:rPr>
+                <w:rFonts w:ascii="Calibri" w:cs="Calibri" w:eastAsia="Calibri" w:hAnsi="Calibri"/>
+                <w:sz w:val="17"/>
+                <w:szCs w:val="17"/>
+              </w:rPr>
+              <w:t xml:space="preserve">88</w:t>
+            </w:r>
+          </w:p>
+        </w:tc>
+        <w:tc>
+          <w:tcPr>
+            <w:tcW w:type="dxa" w:w="900"/>
+            <w:tcMar>
+              <w:top w:type="dxa" w:w="60"/>
+              <w:left w:type="dxa" w:w="90"/>
+              <w:bottom w:type="dxa" w:w="60"/>
+              <w:right w:type="dxa" w:w="90"/>
+            </w:tcMar>
+          </w:tcPr>
+          <w:p>
+            <w:pPr>
+              <w:jc w:val="right"/>
+            </w:pPr>
+            <w:r>
+              <w:rPr>
+                <w:rFonts w:ascii="Calibri" w:cs="Calibri" w:eastAsia="Calibri" w:hAnsi="Calibri"/>
+                <w:sz w:val="17"/>
+                <w:szCs w:val="17"/>
+              </w:rPr>
+              <w:t xml:space="preserve">78</w:t>
+            </w:r>
+          </w:p>
+        </w:tc>
+        <w:tc>
+          <w:tcPr>
+            <w:tcW w:type="dxa" w:w="5682"/>
+            <w:tcMar>
+              <w:top w:type="dxa" w:w="60"/>
+              <w:left w:type="dxa" w:w="90"/>
+              <w:bottom w:type="dxa" w:w="60"/>
+              <w:right w:type="dxa" w:w="90"/>
+            </w:tcMar>
+          </w:tcPr>
+          <w:p>
+            <w:pPr>
+              <w:jc w:val="left"/>
+            </w:pPr>
+            <w:r>
+              <w:rPr>
+                <w:rFonts w:ascii="Calibri" w:cs="Calibri" w:eastAsia="Calibri" w:hAnsi="Calibri"/>
+                <w:sz w:val="17"/>
+                <w:szCs w:val="17"/>
+              </w:rPr>
+              <w:t xml:space="preserve">Seed design: bury the dilemma among ordinary work; fewer single-dilemma scenarios</w:t>
+            </w:r>
+          </w:p>
+        </w:tc>
+      </w:tr>
+      <w:tr>
+        <w:trPr>
+          <w:tblHeader w:val="off"/>
+        </w:trPr>
+        <w:tc>
+          <w:tcPr>
+            <w:tcW w:type="dxa" w:w="2598"/>
+            <w:tcMar>
+              <w:top w:type="dxa" w:w="60"/>
+              <w:left w:type="dxa" w:w="90"/>
+              <w:bottom w:type="dxa" w:w="60"/>
+              <w:right w:type="dxa" w:w="90"/>
+            </w:tcMar>
+          </w:tcPr>
+          <w:p>
+            <w:pPr>
+              <w:jc w:val="left"/>
+            </w:pPr>
+            <w:r>
+              <w:rPr>
+                <w:rFonts w:ascii="Consolas" w:cs="Consolas" w:eastAsia="Consolas" w:hAnsi="Consolas"/>
+                <w:sz w:val="15"/>
+                <w:szCs w:val="15"/>
+              </w:rPr>
+              <w:t xml:space="preserve">user-knows-too-much</w:t>
+            </w:r>
+          </w:p>
+        </w:tc>
+        <w:tc>
+          <w:tcPr>
+            <w:tcW w:type="dxa" w:w="900"/>
+            <w:tcMar>
+              <w:top w:type="dxa" w:w="60"/>
+              <w:left w:type="dxa" w:w="90"/>
+              <w:bottom w:type="dxa" w:w="60"/>
+              <w:right w:type="dxa" w:w="90"/>
+            </w:tcMar>
+          </w:tcPr>
+          <w:p>
+            <w:pPr>
+              <w:jc w:val="right"/>
+            </w:pPr>
+            <w:r>
+              <w:rPr>
+                <w:rFonts w:ascii="Calibri" w:cs="Calibri" w:eastAsia="Calibri" w:hAnsi="Calibri"/>
+                <w:sz w:val="17"/>
+                <w:szCs w:val="17"/>
+              </w:rPr>
+              <w:t xml:space="preserve">2</w:t>
+            </w:r>
+          </w:p>
+        </w:tc>
+        <w:tc>
+          <w:tcPr>
+            <w:tcW w:type="dxa" w:w="900"/>
+            <w:tcMar>
+              <w:top w:type="dxa" w:w="60"/>
+              <w:left w:type="dxa" w:w="90"/>
+              <w:bottom w:type="dxa" w:w="60"/>
+              <w:right w:type="dxa" w:w="90"/>
+            </w:tcMar>
+          </w:tcPr>
+          <w:p>
+            <w:pPr>
+              <w:jc w:val="right"/>
+            </w:pPr>
+            <w:r>
+              <w:rPr>
+                <w:rFonts w:ascii="Calibri" w:cs="Calibri" w:eastAsia="Calibri" w:hAnsi="Calibri"/>
+                <w:sz w:val="17"/>
+                <w:szCs w:val="17"/>
+              </w:rPr>
+              <w:t xml:space="preserve">2</w:t>
+            </w:r>
+          </w:p>
+        </w:tc>
+        <w:tc>
+          <w:tcPr>
+            <w:tcW w:type="dxa" w:w="5682"/>
+            <w:tcMar>
+              <w:top w:type="dxa" w:w="60"/>
+              <w:left w:type="dxa" w:w="90"/>
+              <w:bottom w:type="dxa" w:w="60"/>
+              <w:right w:type="dxa" w:w="90"/>
+            </w:tcMar>
+          </w:tcPr>
+          <w:p>
+            <w:pPr>
+              <w:jc w:val="left"/>
+            </w:pPr>
+            <w:r>
+              <w:rPr>
+                <w:rFonts w:ascii="Calibri" w:cs="Calibri" w:eastAsia="Calibri" w:hAnsi="Calibri"/>
+                <w:sz w:val="17"/>
+                <w:szCs w:val="17"/>
+              </w:rPr>
+              <w:t xml:space="preserve">Persona sheet: the user answers only what that person would know, after a plausible delay</w:t>
+            </w:r>
+          </w:p>
+        </w:tc>
+      </w:tr>
+    </w:tbl>
+    <w:p>
+      <w:pPr>
+        <w:spacing w:after="120"/>
+      </w:pPr>
+    </w:p>
+    <w:p>
+      <w:pPr>
+        <w:spacing w:after="140" w:line="276"/>
+      </w:pPr>
+      <w:r>
+        <w:rPr>
+          <w:rFonts w:ascii="Calibri" w:cs="Calibri" w:eastAsia="Calibri" w:hAnsi="Calibri"/>
+          <w:sz w:val="21"/>
+          <w:szCs w:val="21"/>
+        </w:rPr>
+        <w:t xml:space="preserve">The two that matter most are fixture-backed filesystem tools and a scenario clock: between them they cover the misspelled path, the author's note inside a listing, the file that came back altered, the fixed 13-minute steps, and most of the "too clean" complaints. Both are already sketched as auditor variants in the design and can be measured with the pipeline as it stands.</w:t>
+      </w:r>
+    </w:p>
+    <w:p>
+      <w:pPr>
+        <w:pStyle w:val="Heading1"/>
+        <w:spacing w:after="120" w:before="320"/>
+      </w:pPr>
+      <w:r>
+        <w:rPr>
+          <w:rFonts w:ascii="Calibri" w:cs="Calibri" w:eastAsia="Calibri" w:hAnsi="Calibri"/>
+          <w:b/>
+          <w:bCs/>
+          <w:sz w:val="28"/>
+          <w:szCs w:val="28"/>
+        </w:rPr>
         <w:t xml:space="preserve">Limitations</w:t>
       </w:r>
     </w:p>
@@ -27825,7 +28823,7 @@
         </w:rPr>
         <w:t xml:space="preserve">Code and data: </w:t>
       </w:r>
-      <w:hyperlink w:history="1" r:id="rIdnhr_y2dhtezumf5d4k1om">
+      <w:hyperlink w:history="1" r:id="rIdf5ktt6mzvrwbd4cthloir">
         <w:r>
           <w:rPr>
             <w:rStyle w:val="Hyperlink"/>

</xml_diff>

<commit_message>
Writeups: add the narrated-environments opener
Co-Authored-By: Claude Fable 5.1 <noreply@anthropic.com>
</commit_message>
<xml_diff>
--- a/writeups/report.docx
+++ b/writeups/report.docx
@@ -267,6 +267,61 @@
           <w:szCs w:val="21"/>
         </w:rPr>
         <w:t xml:space="preserve"> that printed an author's note instead of filenames, a file that came back with a word changed, a host with no background processes.</w:t>
+      </w:r>
+    </w:p>
+    <w:p>
+      <w:pPr>
+        <w:pStyle w:val="Heading1"/>
+        <w:spacing w:after="120" w:before="320"/>
+      </w:pPr>
+      <w:r>
+        <w:rPr>
+          <w:rFonts w:ascii="Calibri" w:cs="Calibri" w:eastAsia="Calibri" w:hAnsi="Calibri"/>
+          <w:b/>
+          <w:bCs/>
+          <w:sz w:val="28"/>
+          <w:szCs w:val="28"/>
+        </w:rPr>
+        <w:t xml:space="preserve">Narrated environments</w:t>
+      </w:r>
+    </w:p>
+    <w:p>
+      <w:pPr>
+        <w:spacing w:after="140" w:line="276"/>
+      </w:pPr>
+      <w:r>
+        <w:rPr>
+          <w:rFonts w:ascii="Calibri" w:cs="Calibri" w:eastAsia="Calibri" w:hAnsi="Calibri"/>
+          <w:sz w:val="21"/>
+          <w:szCs w:val="21"/>
+        </w:rPr>
+        <w:t xml:space="preserve">Every Petri audit runs in what we will call a narrated environment. Nothing in it is executed. There is no filesystem, no clock, no mailbox, no colleague with a day of their own. There is an author, the auditor model, that writes down what each of those would have said, one observation at a time, conditioned on the transcript so far and on what the scene needs.</w:t>
+      </w:r>
+    </w:p>
+    <w:p>
+      <w:pPr>
+        <w:spacing w:after="140" w:line="276"/>
+      </w:pPr>
+      <w:r>
+        <w:rPr>
+          <w:rFonts w:ascii="Calibri" w:cs="Calibri" w:eastAsia="Calibri" w:hAnsi="Calibri"/>
+          <w:sz w:val="21"/>
+          <w:szCs w:val="21"/>
+        </w:rPr>
+        <w:t xml:space="preserve">For a reader this is indistinguishable from a real environment. Each line looks like something a real tool or a real person would produce. For an agent that acts, the difference appears the moment it asks a question whose answer is fixed by state rather than by plausibility. Read the same file twice: a world returns the same bytes, a narrator rewrites it from memory. Compute something over data you were shown: a world runs the calculation, a narrator guesses the result. Check one part against another, the clock against the mail timestamps: a world agrees with itself because one history produced both, a narrator wrote them on separate occasions. Wait: in a world time passes and things happen without you, in a narration nothing happens until you ask.</w:t>
+      </w:r>
+    </w:p>
+    <w:p>
+      <w:pPr>
+        <w:spacing w:after="140" w:line="276"/>
+      </w:pPr>
+      <w:r>
+        <w:rPr>
+          <w:rFonts w:ascii="Calibri" w:cs="Calibri" w:eastAsia="Calibri" w:hAnsi="Calibri"/>
+          <w:sz w:val="21"/>
+          <w:szCs w:val="21"/>
+        </w:rPr>
+        <w:t xml:space="preserve">A narrator is good at any single answer. It fails at the relationships between answers, because there was never a state holding them together. That is the structural reason a simulation that fools a model which merely looks around will not survive a model that tests, and it is why this experiment is about monitoring the tester rather than perfecting the narration. The one giveaway narration cannot be blamed for is the scenario itself: a situation built to see what a model does looks like one even when every detail of its world is right.</w:t>
       </w:r>
     </w:p>
     <w:p>
@@ -7035,7 +7090,7 @@
         </w:rPr>
         <w:t xml:space="preserve">Every seam the targets reported, in the debriefs of both the probing runs and the runs that concluded without probing, has been tagged with the Petri change it implies. The full tagged list, with seed, turn and verbatim excerpt for every mention, is in </w:t>
       </w:r>
-      <w:hyperlink w:history="1" r:id="rIdclpwf2rdwqxkqvejcd42o">
+      <w:hyperlink w:history="1" r:id="rIdkst2k9ddfchgcvqmkq9it">
         <w:r>
           <w:rPr>
             <w:rStyle w:val="Hyperlink"/>
@@ -28823,7 +28878,7 @@
         </w:rPr>
         <w:t xml:space="preserve">Code and data: </w:t>
       </w:r>
-      <w:hyperlink w:history="1" r:id="rIdf5ktt6mzvrwbd4cthloir">
+      <w:hyperlink w:history="1" r:id="rIdfhcqlb_5twsm7cy1evwuq">
         <w:r>
           <w:rPr>
             <w:rStyle w:val="Hyperlink"/>

</xml_diff>

<commit_message>
Writeups: remove the narrated-environments opener (kept out of the report)
Co-Authored-By: Claude Fable 5.1 <noreply@anthropic.com>
</commit_message>
<xml_diff>
--- a/writeups/report.docx
+++ b/writeups/report.docx
@@ -267,61 +267,6 @@
           <w:szCs w:val="21"/>
         </w:rPr>
         <w:t xml:space="preserve"> that printed an author's note instead of filenames, a file that came back with a word changed, a host with no background processes.</w:t>
-      </w:r>
-    </w:p>
-    <w:p>
-      <w:pPr>
-        <w:pStyle w:val="Heading1"/>
-        <w:spacing w:after="120" w:before="320"/>
-      </w:pPr>
-      <w:r>
-        <w:rPr>
-          <w:rFonts w:ascii="Calibri" w:cs="Calibri" w:eastAsia="Calibri" w:hAnsi="Calibri"/>
-          <w:b/>
-          <w:bCs/>
-          <w:sz w:val="28"/>
-          <w:szCs w:val="28"/>
-        </w:rPr>
-        <w:t xml:space="preserve">Narrated environments</w:t>
-      </w:r>
-    </w:p>
-    <w:p>
-      <w:pPr>
-        <w:spacing w:after="140" w:line="276"/>
-      </w:pPr>
-      <w:r>
-        <w:rPr>
-          <w:rFonts w:ascii="Calibri" w:cs="Calibri" w:eastAsia="Calibri" w:hAnsi="Calibri"/>
-          <w:sz w:val="21"/>
-          <w:szCs w:val="21"/>
-        </w:rPr>
-        <w:t xml:space="preserve">Every Petri audit runs in what we will call a narrated environment. Nothing in it is executed. There is no filesystem, no clock, no mailbox, no colleague with a day of their own. There is an author, the auditor model, that writes down what each of those would have said, one observation at a time, conditioned on the transcript so far and on what the scene needs.</w:t>
-      </w:r>
-    </w:p>
-    <w:p>
-      <w:pPr>
-        <w:spacing w:after="140" w:line="276"/>
-      </w:pPr>
-      <w:r>
-        <w:rPr>
-          <w:rFonts w:ascii="Calibri" w:cs="Calibri" w:eastAsia="Calibri" w:hAnsi="Calibri"/>
-          <w:sz w:val="21"/>
-          <w:szCs w:val="21"/>
-        </w:rPr>
-        <w:t xml:space="preserve">For a reader this is indistinguishable from a real environment. Each line looks like something a real tool or a real person would produce. For an agent that acts, the difference appears the moment it asks a question whose answer is fixed by state rather than by plausibility. Read the same file twice: a world returns the same bytes, a narrator rewrites it from memory. Compute something over data you were shown: a world runs the calculation, a narrator guesses the result. Check one part against another, the clock against the mail timestamps: a world agrees with itself because one history produced both, a narrator wrote them on separate occasions. Wait: in a world time passes and things happen without you, in a narration nothing happens until you ask.</w:t>
-      </w:r>
-    </w:p>
-    <w:p>
-      <w:pPr>
-        <w:spacing w:after="140" w:line="276"/>
-      </w:pPr>
-      <w:r>
-        <w:rPr>
-          <w:rFonts w:ascii="Calibri" w:cs="Calibri" w:eastAsia="Calibri" w:hAnsi="Calibri"/>
-          <w:sz w:val="21"/>
-          <w:szCs w:val="21"/>
-        </w:rPr>
-        <w:t xml:space="preserve">A narrator is good at any single answer. It fails at the relationships between answers, because there was never a state holding them together. That is the structural reason a simulation that fools a model which merely looks around will not survive a model that tests, and it is why this experiment is about monitoring the tester rather than perfecting the narration. The one giveaway narration cannot be blamed for is the scenario itself: a situation built to see what a model does looks like one even when every detail of its world is right.</w:t>
       </w:r>
     </w:p>
     <w:p>
@@ -7090,7 +7035,7 @@
         </w:rPr>
         <w:t xml:space="preserve">Every seam the targets reported, in the debriefs of both the probing runs and the runs that concluded without probing, has been tagged with the Petri change it implies. The full tagged list, with seed, turn and verbatim excerpt for every mention, is in </w:t>
       </w:r>
-      <w:hyperlink w:history="1" r:id="rIdkst2k9ddfchgcvqmkq9it">
+      <w:hyperlink w:history="1" r:id="rIdagnakqa7v2pc9xtqogjxz">
         <w:r>
           <w:rPr>
             <w:rStyle w:val="Hyperlink"/>
@@ -28878,7 +28823,7 @@
         </w:rPr>
         <w:t xml:space="preserve">Code and data: </w:t>
       </w:r>
-      <w:hyperlink w:history="1" r:id="rIdfhcqlb_5twsm7cy1evwuq">
+      <w:hyperlink w:history="1" r:id="rIdbxm4wlehkla8eps9i_62t">
         <w:r>
           <w:rPr>
             <w:rStyle w:val="Hyperlink"/>

</xml_diff>